<commit_message>
Update WorkLog week 6
</commit_message>
<xml_diff>
--- a/Work/2022182017_BGC/WorkLog/백경철_작업일지_6주차.docx
+++ b/Work/2022182017_BGC/WorkLog/백경철_작업일지_6주차.docx
@@ -365,9 +365,6 @@
         <w:tabs>
           <w:tab w:val="left" w:pos="2765"/>
         </w:tabs>
-        <w:rPr>
-          <w:rFonts w:hint="eastAsia"/>
-        </w:rPr>
       </w:pPr>
       <w:r>
         <w:rPr>
@@ -418,9 +415,6 @@
         <w:tabs>
           <w:tab w:val="left" w:pos="2765"/>
         </w:tabs>
-        <w:rPr>
-          <w:rFonts w:hint="eastAsia"/>
-        </w:rPr>
       </w:pPr>
     </w:p>
     <w:p>
@@ -467,9 +461,6 @@
         <w:tabs>
           <w:tab w:val="left" w:pos="2765"/>
         </w:tabs>
-        <w:rPr>
-          <w:rFonts w:hint="eastAsia"/>
-        </w:rPr>
       </w:pPr>
       <w:r>
         <w:rPr>
@@ -573,13 +564,7 @@
         <w:rPr>
           <w:rFonts w:hint="eastAsia"/>
         </w:rPr>
-        <w:t>로</w:t>
-      </w:r>
-      <w:r>
-        <w:rPr>
-          <w:rFonts w:hint="eastAsia"/>
-        </w:rPr>
-        <w:t xml:space="preserve"> </w:t>
+        <w:t xml:space="preserve">로 </w:t>
       </w:r>
       <w:r>
         <w:rPr>
@@ -718,9 +703,6 @@
         <w:tabs>
           <w:tab w:val="left" w:pos="2765"/>
         </w:tabs>
-        <w:rPr>
-          <w:rFonts w:hint="eastAsia"/>
-        </w:rPr>
       </w:pPr>
       <w:r>
         <w:rPr>
@@ -1019,7 +1001,7 @@
               <w:rPr>
                 <w:rFonts w:hint="eastAsia"/>
               </w:rPr>
-              <w:t>레벨 테스트</w:t>
+              <w:t>플레이어와 특정 오브젝트의 상호작용 구현</w:t>
             </w:r>
           </w:p>
         </w:tc>
@@ -1081,13 +1063,7 @@
         </w:tc>
       </w:tr>
     </w:tbl>
-    <w:p>
-      <w:pPr>
-        <w:rPr>
-          <w:rFonts w:hint="eastAsia"/>
-        </w:rPr>
-      </w:pPr>
-    </w:p>
+    <w:p/>
     <w:sectPr>
       <w:headerReference w:type="default" r:id="rId7"/>
       <w:pgSz w:w="11906" w:h="16838"/>

</xml_diff>